<commit_message>
feat(rag): universal polyglot language mirroring and multi-language support
</commit_message>
<xml_diff>
--- a/data/Juvelle_Knowledge_Base.docx
+++ b/data/Juvelle_Knowledge_Base.docx
@@ -3,24 +3,29 @@
 <w:document xmlns:wpc="http://schemas.microsoft.com/office/word/2010/wordprocessingCanvas" xmlns:mo="http://schemas.microsoft.com/office/mac/office/2008/main" xmlns:mc="http://schemas.openxmlformats.org/markup-compatibility/2006" xmlns:mv="urn:schemas-microsoft-com:mac:vml" xmlns:o="urn:schemas-microsoft-com:office:office" xmlns:r="http://schemas.openxmlformats.org/officeDocument/2006/relationships" xmlns:m="http://schemas.openxmlformats.org/officeDocument/2006/math" xmlns:v="urn:schemas-microsoft-com:vml" xmlns:wp14="http://schemas.microsoft.com/office/word/2010/wordprocessingDrawing" xmlns:wp="http://schemas.openxmlformats.org/drawingml/2006/wordprocessingDrawing" xmlns:w10="urn:schemas-microsoft-com:office:word" xmlns:w="http://schemas.openxmlformats.org/wordprocessingml/2006/main" xmlns:w14="http://schemas.microsoft.com/office/word/2010/wordml" xmlns:wpg="http://schemas.microsoft.com/office/word/2010/wordprocessingGroup" xmlns:wpi="http://schemas.microsoft.com/office/word/2010/wordprocessingInk" xmlns:wne="http://schemas.microsoft.com/office/word/2006/wordml" xmlns:wps="http://schemas.microsoft.com/office/word/2010/wordprocessingShape" mc:Ignorable="w14 wp14">
   <w:body>
     <w:p>
+      <w:pPr>
+        <w:spacing w:after="280"/>
+      </w:pPr>
       <w:r>
         <w:rPr>
+          <w:rFonts w:ascii="Arial" w:hAnsi="Arial"/>
           <w:b/>
-          <w:color w:val="3797F0"/>
-          <w:sz w:val="44"/>
+          <w:color w:val="1E293B"/>
+          <w:sz w:val="40"/>
         </w:rPr>
         <w:t>Juvelle Boutique - Master Knowledge Base &amp; FAQ</w:t>
       </w:r>
     </w:p>
     <w:p>
       <w:pPr>
-        <w:spacing w:before="240" w:after="80"/>
+        <w:spacing w:before="280" w:after="120"/>
       </w:pPr>
       <w:r>
         <w:rPr>
+          <w:rFonts w:ascii="Arial" w:hAnsi="Arial"/>
           <w:b/>
-          <w:color w:val="1E1E1E"/>
-          <w:sz w:val="28"/>
+          <w:color w:val="0F172A"/>
+          <w:sz w:val="26"/>
         </w:rPr>
         <w:t>1. Brand Identity &amp; Product Catalog</w:t>
       </w:r>
@@ -28,107 +33,128 @@
     <w:p>
       <w:pPr>
         <w:pStyle w:val="ListBullet"/>
-        <w:spacing w:after="60"/>
+        <w:spacing w:after="80" w:line="276" w:lineRule="auto"/>
       </w:pPr>
       <w:r>
         <w:rPr>
+          <w:rFonts w:ascii="Arial" w:hAnsi="Arial"/>
           <w:b/>
+          <w:color w:val="1E293B"/>
           <w:sz w:val="21"/>
         </w:rPr>
-        <w:t>Brand Overview:</w:t>
+        <w:t xml:space="preserve">Brand Overview: </w:t>
       </w:r>
       <w:r>
         <w:rPr>
+          <w:rFonts w:ascii="Arial" w:hAnsi="Arial"/>
+          <w:color w:val="334155"/>
           <w:sz w:val="21"/>
         </w:rPr>
-        <w:t xml:space="preserve"> Juvelle is an exclusive women's fashion boutique based in Kerala, providing premium quality ethnic and daily wear tops at direct-to-consumer prices.</w:t>
+        <w:t>Juvelle is an exclusive women's fashion boutique based in Kerala, providing premium quality ethnic and daily wear tops at direct-to-consumer prices.</w:t>
       </w:r>
     </w:p>
     <w:p>
       <w:pPr>
         <w:pStyle w:val="ListBullet"/>
-        <w:spacing w:after="60"/>
+        <w:spacing w:after="80" w:line="276" w:lineRule="auto"/>
       </w:pPr>
       <w:r>
         <w:rPr>
+          <w:rFonts w:ascii="Arial" w:hAnsi="Arial"/>
           <w:b/>
+          <w:color w:val="1E293B"/>
           <w:sz w:val="21"/>
         </w:rPr>
-        <w:t>Specialty Products:</w:t>
+        <w:t xml:space="preserve">Specialty Products: </w:t>
       </w:r>
       <w:r>
         <w:rPr>
+          <w:rFonts w:ascii="Arial" w:hAnsi="Arial"/>
+          <w:color w:val="334155"/>
           <w:sz w:val="21"/>
         </w:rPr>
-        <w:t xml:space="preserve"> Exclusively women's Churidar tops crafted for daily wear, office wear, and college wear.</w:t>
+        <w:t>Exclusively women's Churidar tops crafted for daily wear, office wear, and college wear.</w:t>
       </w:r>
     </w:p>
     <w:p>
       <w:pPr>
         <w:pStyle w:val="ListBullet"/>
-        <w:spacing w:after="60"/>
+        <w:spacing w:after="80" w:line="276" w:lineRule="auto"/>
       </w:pPr>
       <w:r>
         <w:rPr>
+          <w:rFonts w:ascii="Arial" w:hAnsi="Arial"/>
           <w:b/>
+          <w:color w:val="1E293B"/>
           <w:sz w:val="21"/>
         </w:rPr>
-        <w:t>Fabrics &amp; Materials:</w:t>
+        <w:t xml:space="preserve">Fabrics &amp; Materials: </w:t>
       </w:r>
       <w:r>
         <w:rPr>
+          <w:rFonts w:ascii="Arial" w:hAnsi="Arial"/>
+          <w:color w:val="334155"/>
           <w:sz w:val="21"/>
         </w:rPr>
-        <w:t xml:space="preserve"> Crafted with 100% breathable pure cotton and soft premium rayon blends, thoroughly tested for all-day comfort in tropical climates.</w:t>
+        <w:t>Crafted with 100% breathable pure cotton and soft premium rayon blends, thoroughly tested for all-day comfort in tropical climates.</w:t>
       </w:r>
     </w:p>
     <w:p>
       <w:pPr>
         <w:pStyle w:val="ListBullet"/>
-        <w:spacing w:after="60"/>
+        <w:spacing w:after="80" w:line="276" w:lineRule="auto"/>
       </w:pPr>
       <w:r>
         <w:rPr>
+          <w:rFonts w:ascii="Arial" w:hAnsi="Arial"/>
           <w:b/>
+          <w:color w:val="1E293B"/>
           <w:sz w:val="21"/>
         </w:rPr>
-        <w:t>Price Range:</w:t>
+        <w:t xml:space="preserve">Price Range: </w:t>
       </w:r>
       <w:r>
         <w:rPr>
+          <w:rFonts w:ascii="Arial" w:hAnsi="Arial"/>
+          <w:color w:val="334155"/>
           <w:sz w:val="21"/>
         </w:rPr>
-        <w:t xml:space="preserve"> Standard retail prices range affordably between ₹399 and ₹899.</w:t>
+        <w:t>Standard retail prices range affordably between ₹399 and ₹899.</w:t>
       </w:r>
     </w:p>
     <w:p>
       <w:pPr>
         <w:pStyle w:val="ListBullet"/>
-        <w:spacing w:after="60"/>
+        <w:spacing w:after="80" w:line="276" w:lineRule="auto"/>
       </w:pPr>
       <w:r>
         <w:rPr>
+          <w:rFonts w:ascii="Arial" w:hAnsi="Arial"/>
           <w:b/>
+          <w:color w:val="1E293B"/>
           <w:sz w:val="21"/>
         </w:rPr>
-        <w:t>Strict Exclusions:</w:t>
+        <w:t xml:space="preserve">Strict Exclusions: </w:t>
       </w:r>
       <w:r>
         <w:rPr>
+          <w:rFonts w:ascii="Arial" w:hAnsi="Arial"/>
+          <w:color w:val="334155"/>
           <w:sz w:val="21"/>
         </w:rPr>
-        <w:t xml:space="preserve"> Juvelle does NOT sell sarees, frocks, jeans, t-shirts, western wear, kids wear, or men's clothing.</w:t>
+        <w:t>Juvelle does NOT sell sarees, frocks, jeans, t-shirts, western wear, kids wear, or men's clothing.</w:t>
       </w:r>
     </w:p>
     <w:p>
       <w:pPr>
-        <w:spacing w:before="240" w:after="80"/>
+        <w:spacing w:before="280" w:after="120"/>
       </w:pPr>
       <w:r>
         <w:rPr>
+          <w:rFonts w:ascii="Arial" w:hAnsi="Arial"/>
           <w:b/>
-          <w:color w:val="1E1E1E"/>
-          <w:sz w:val="28"/>
+          <w:color w:val="0F172A"/>
+          <w:sz w:val="26"/>
         </w:rPr>
         <w:t>2. Shipping &amp; Delivery Policies</w:t>
       </w:r>
@@ -136,88 +162,105 @@
     <w:p>
       <w:pPr>
         <w:pStyle w:val="ListBullet"/>
-        <w:spacing w:after="60"/>
+        <w:spacing w:after="80" w:line="276" w:lineRule="auto"/>
       </w:pPr>
       <w:r>
         <w:rPr>
+          <w:rFonts w:ascii="Arial" w:hAnsi="Arial"/>
           <w:b/>
+          <w:color w:val="1E293B"/>
           <w:sz w:val="21"/>
         </w:rPr>
-        <w:t>Coverage Area:</w:t>
+        <w:t xml:space="preserve">Coverage Area: </w:t>
       </w:r>
       <w:r>
         <w:rPr>
+          <w:rFonts w:ascii="Arial" w:hAnsi="Arial"/>
+          <w:color w:val="334155"/>
           <w:sz w:val="21"/>
         </w:rPr>
-        <w:t xml:space="preserve"> Delivery is available exclusively within Kerala. We do NOT ship to other Indian states (such as Bangalore, Chennai, Mumbai) or internationally.</w:t>
+        <w:t>Delivery is available exclusively within Kerala. We do NOT ship to other Indian states (such as Bangalore, Chennai, Mumbai) or internationally.</w:t>
       </w:r>
     </w:p>
     <w:p>
       <w:pPr>
         <w:pStyle w:val="ListBullet"/>
-        <w:spacing w:after="60"/>
+        <w:spacing w:after="80" w:line="276" w:lineRule="auto"/>
       </w:pPr>
       <w:r>
         <w:rPr>
+          <w:rFonts w:ascii="Arial" w:hAnsi="Arial"/>
           <w:b/>
+          <w:color w:val="1E293B"/>
           <w:sz w:val="21"/>
         </w:rPr>
-        <w:t>Courier Partner:</w:t>
+        <w:t xml:space="preserve">Courier Partner: </w:t>
       </w:r>
       <w:r>
         <w:rPr>
+          <w:rFonts w:ascii="Arial" w:hAnsi="Arial"/>
+          <w:color w:val="334155"/>
           <w:sz w:val="21"/>
         </w:rPr>
-        <w:t xml:space="preserve"> All parcels are shipped safely via Delhivery courier service with end-to-end tracking.</w:t>
+        <w:t>All parcels are shipped safely via Delhivery courier service with end-to-end tracking.</w:t>
       </w:r>
     </w:p>
     <w:p>
       <w:pPr>
         <w:pStyle w:val="ListBullet"/>
-        <w:spacing w:after="60"/>
+        <w:spacing w:after="80" w:line="276" w:lineRule="auto"/>
       </w:pPr>
       <w:r>
         <w:rPr>
+          <w:rFonts w:ascii="Arial" w:hAnsi="Arial"/>
           <w:b/>
+          <w:color w:val="1E293B"/>
           <w:sz w:val="21"/>
         </w:rPr>
-        <w:t>Dispatch Timeline:</w:t>
+        <w:t xml:space="preserve">Dispatch Timeline: </w:t>
       </w:r>
       <w:r>
         <w:rPr>
+          <w:rFonts w:ascii="Arial" w:hAnsi="Arial"/>
+          <w:color w:val="334155"/>
           <w:sz w:val="21"/>
         </w:rPr>
-        <w:t xml:space="preserve"> Orders are dispatched on the next business day following payment verification.</w:t>
+        <w:t>Orders are dispatched on the next business day following payment verification.</w:t>
       </w:r>
     </w:p>
     <w:p>
       <w:pPr>
         <w:pStyle w:val="ListBullet"/>
-        <w:spacing w:after="60"/>
+        <w:spacing w:after="80" w:line="276" w:lineRule="auto"/>
       </w:pPr>
       <w:r>
         <w:rPr>
+          <w:rFonts w:ascii="Arial" w:hAnsi="Arial"/>
           <w:b/>
+          <w:color w:val="1E293B"/>
           <w:sz w:val="21"/>
         </w:rPr>
-        <w:t>Delivery Duration:</w:t>
+        <w:t xml:space="preserve">Delivery Duration: </w:t>
       </w:r>
       <w:r>
         <w:rPr>
+          <w:rFonts w:ascii="Arial" w:hAnsi="Arial"/>
+          <w:color w:val="334155"/>
           <w:sz w:val="21"/>
         </w:rPr>
-        <w:t xml:space="preserve"> Standard delivery takes 2 to 3 business days anywhere inside Kerala.</w:t>
+        <w:t>Standard delivery takes 2 to 3 business days anywhere inside Kerala.</w:t>
       </w:r>
     </w:p>
     <w:p>
       <w:pPr>
-        <w:spacing w:before="240" w:after="80"/>
+        <w:spacing w:before="280" w:after="120"/>
       </w:pPr>
       <w:r>
         <w:rPr>
+          <w:rFonts w:ascii="Arial" w:hAnsi="Arial"/>
           <w:b/>
-          <w:color w:val="1E1E1E"/>
-          <w:sz w:val="28"/>
+          <w:color w:val="0F172A"/>
+          <w:sz w:val="26"/>
         </w:rPr>
         <w:t>3. Ordering Process &amp; Payment Methods</w:t>
       </w:r>
@@ -225,88 +268,105 @@
     <w:p>
       <w:pPr>
         <w:pStyle w:val="ListBullet"/>
-        <w:spacing w:after="60"/>
+        <w:spacing w:after="80" w:line="276" w:lineRule="auto"/>
       </w:pPr>
       <w:r>
         <w:rPr>
+          <w:rFonts w:ascii="Arial" w:hAnsi="Arial"/>
           <w:b/>
+          <w:color w:val="1E293B"/>
           <w:sz w:val="21"/>
         </w:rPr>
-        <w:t>No Website:</w:t>
+        <w:t xml:space="preserve">No Website: </w:t>
       </w:r>
       <w:r>
         <w:rPr>
+          <w:rFonts w:ascii="Arial" w:hAnsi="Arial"/>
+          <w:color w:val="334155"/>
           <w:sz w:val="21"/>
         </w:rPr>
-        <w:t xml:space="preserve"> Juvelle operates directly through direct messaging on Instagram and WhatsApp without a separate e-commerce website.</w:t>
+        <w:t>Juvelle operates directly through direct messaging on Instagram and WhatsApp without a separate e-commerce website.</w:t>
       </w:r>
     </w:p>
     <w:p>
       <w:pPr>
         <w:pStyle w:val="ListBullet"/>
-        <w:spacing w:after="60"/>
+        <w:spacing w:after="80" w:line="276" w:lineRule="auto"/>
       </w:pPr>
       <w:r>
         <w:rPr>
+          <w:rFonts w:ascii="Arial" w:hAnsi="Arial"/>
           <w:b/>
+          <w:color w:val="1E293B"/>
           <w:sz w:val="21"/>
         </w:rPr>
-        <w:t>How to Order:</w:t>
+        <w:t xml:space="preserve">How to Order: </w:t>
       </w:r>
       <w:r>
         <w:rPr>
+          <w:rFonts w:ascii="Arial" w:hAnsi="Arial"/>
+          <w:color w:val="334155"/>
           <w:sz w:val="21"/>
         </w:rPr>
-        <w:t xml:space="preserve"> Customers simply send a screenshot or photo of the top they like along with their required size (S, M, L, XL, XXL).</w:t>
+        <w:t>Customers simply send a screenshot or photo of the top they like along with their required size (S, M, L, XL, XXL).</w:t>
       </w:r>
     </w:p>
     <w:p>
       <w:pPr>
         <w:pStyle w:val="ListBullet"/>
-        <w:spacing w:after="60"/>
+        <w:spacing w:after="80" w:line="276" w:lineRule="auto"/>
       </w:pPr>
       <w:r>
         <w:rPr>
+          <w:rFonts w:ascii="Arial" w:hAnsi="Arial"/>
           <w:b/>
+          <w:color w:val="1E293B"/>
           <w:sz w:val="21"/>
         </w:rPr>
-        <w:t>Payment Options:</w:t>
+        <w:t xml:space="preserve">Payment Options: </w:t>
       </w:r>
       <w:r>
         <w:rPr>
+          <w:rFonts w:ascii="Arial" w:hAnsi="Arial"/>
+          <w:color w:val="334155"/>
           <w:sz w:val="21"/>
         </w:rPr>
-        <w:t xml:space="preserve"> 100% online advance payment via UPI (Google Pay, PhonePe, Paytm, BHIM) or direct Bank Transfer.</w:t>
+        <w:t>100% online advance payment via UPI (Google Pay, PhonePe, Paytm, BHIM) or direct Bank Transfer.</w:t>
       </w:r>
     </w:p>
     <w:p>
       <w:pPr>
         <w:pStyle w:val="ListBullet"/>
-        <w:spacing w:after="60"/>
+        <w:spacing w:after="80" w:line="276" w:lineRule="auto"/>
       </w:pPr>
       <w:r>
         <w:rPr>
+          <w:rFonts w:ascii="Arial" w:hAnsi="Arial"/>
           <w:b/>
+          <w:color w:val="1E293B"/>
           <w:sz w:val="21"/>
         </w:rPr>
-        <w:t>No Cash on Delivery:</w:t>
+        <w:t xml:space="preserve">No Cash on Delivery: </w:t>
       </w:r>
       <w:r>
         <w:rPr>
+          <w:rFonts w:ascii="Arial" w:hAnsi="Arial"/>
+          <w:color w:val="334155"/>
           <w:sz w:val="21"/>
         </w:rPr>
-        <w:t xml:space="preserve"> Cash on Delivery (COD) is NOT available to ensure rapid order processing and next-day dispatch.</w:t>
+        <w:t>Cash on Delivery (COD) is NOT available to ensure rapid order processing and next-day dispatch.</w:t>
       </w:r>
     </w:p>
     <w:p>
       <w:pPr>
-        <w:spacing w:before="240" w:after="80"/>
+        <w:spacing w:before="280" w:after="120"/>
       </w:pPr>
       <w:r>
         <w:rPr>
+          <w:rFonts w:ascii="Arial" w:hAnsi="Arial"/>
           <w:b/>
-          <w:color w:val="1E1E1E"/>
-          <w:sz w:val="28"/>
+          <w:color w:val="0F172A"/>
+          <w:sz w:val="26"/>
         </w:rPr>
         <w:t>4. Customer Support, Sizes &amp; Return Policy</w:t>
       </w:r>
@@ -314,77 +374,199 @@
     <w:p>
       <w:pPr>
         <w:pStyle w:val="ListBullet"/>
-        <w:spacing w:after="60"/>
+        <w:spacing w:after="80" w:line="276" w:lineRule="auto"/>
       </w:pPr>
       <w:r>
         <w:rPr>
+          <w:rFonts w:ascii="Arial" w:hAnsi="Arial"/>
           <w:b/>
+          <w:color w:val="1E293B"/>
           <w:sz w:val="21"/>
         </w:rPr>
-        <w:t>Available Sizes:</w:t>
+        <w:t xml:space="preserve">Available Sizes: </w:t>
       </w:r>
       <w:r>
         <w:rPr>
+          <w:rFonts w:ascii="Arial" w:hAnsi="Arial"/>
+          <w:color w:val="334155"/>
           <w:sz w:val="21"/>
         </w:rPr>
-        <w:t xml:space="preserve"> Available in sizes S (36), M (38), L (40), XL (42), and XXL (44). Custom size charts can be provided in chat upon request.</w:t>
+        <w:t>Available in sizes S (36), M (38), L (40), XL (42), and XXL (44). Custom size charts can be provided in chat upon request.</w:t>
       </w:r>
     </w:p>
     <w:p>
       <w:pPr>
         <w:pStyle w:val="ListBullet"/>
-        <w:spacing w:after="60"/>
+        <w:spacing w:after="80" w:line="276" w:lineRule="auto"/>
       </w:pPr>
       <w:r>
         <w:rPr>
+          <w:rFonts w:ascii="Arial" w:hAnsi="Arial"/>
           <w:b/>
+          <w:color w:val="1E293B"/>
           <w:sz w:val="21"/>
         </w:rPr>
-        <w:t>Damage &amp; Exchanges:</w:t>
+        <w:t xml:space="preserve">Damage &amp; Exchanges: </w:t>
       </w:r>
       <w:r>
         <w:rPr>
+          <w:rFonts w:ascii="Arial" w:hAnsi="Arial"/>
+          <w:color w:val="334155"/>
           <w:sz w:val="21"/>
         </w:rPr>
-        <w:t xml:space="preserve"> Damaged items are replaced upon providing an unboxing parcel opening video.</w:t>
+        <w:t>Damaged items are replaced upon providing an unboxing parcel opening video.</w:t>
       </w:r>
     </w:p>
     <w:p>
       <w:pPr>
         <w:pStyle w:val="ListBullet"/>
-        <w:spacing w:after="60"/>
+        <w:spacing w:after="80" w:line="276" w:lineRule="auto"/>
       </w:pPr>
       <w:r>
         <w:rPr>
+          <w:rFonts w:ascii="Arial" w:hAnsi="Arial"/>
           <w:b/>
+          <w:color w:val="1E293B"/>
           <w:sz w:val="21"/>
         </w:rPr>
-        <w:t>Customer Support Hours:</w:t>
+        <w:t xml:space="preserve">Customer Support Hours: </w:t>
       </w:r>
       <w:r>
         <w:rPr>
+          <w:rFonts w:ascii="Arial" w:hAnsi="Arial"/>
+          <w:color w:val="334155"/>
           <w:sz w:val="21"/>
         </w:rPr>
-        <w:t xml:space="preserve"> Support is handled directly in chat 7 days a week.</w:t>
+        <w:t>Support is handled directly in chat 7 days a week.</w:t>
       </w:r>
     </w:p>
     <w:p>
       <w:pPr>
         <w:pStyle w:val="ListBullet"/>
-        <w:spacing w:after="60"/>
+        <w:spacing w:after="80" w:line="276" w:lineRule="auto"/>
       </w:pPr>
       <w:r>
         <w:rPr>
+          <w:rFonts w:ascii="Arial" w:hAnsi="Arial"/>
           <w:b/>
+          <w:color w:val="1E293B"/>
           <w:sz w:val="21"/>
         </w:rPr>
-        <w:t>Language &amp; Tone:</w:t>
+        <w:t xml:space="preserve">Voice Note Perception: </w:t>
       </w:r>
       <w:r>
         <w:rPr>
+          <w:rFonts w:ascii="Arial" w:hAnsi="Arial"/>
+          <w:color w:val="334155"/>
           <w:sz w:val="21"/>
         </w:rPr>
-        <w:t xml:space="preserve"> Polite, friendly, and helpful. Supports English, natural Manglish (without heavy slang), and clean Malayalam script.</w:t>
+        <w:t>Juvelle's AI assistant has full native voice perception capability to listen to, understand, and process customer voice notes and audio messages directly.</w:t>
+      </w:r>
+    </w:p>
+    <w:p>
+      <w:pPr>
+        <w:spacing w:before="280" w:after="120"/>
+      </w:pPr>
+      <w:r>
+        <w:rPr>
+          <w:rFonts w:ascii="Arial" w:hAnsi="Arial"/>
+          <w:b/>
+          <w:color w:val="0F172A"/>
+          <w:sz w:val="26"/>
+        </w:rPr>
+        <w:t>5. Universal Polyglot Support &amp; Multilingual Vocabulary</w:t>
+      </w:r>
+    </w:p>
+    <w:p>
+      <w:pPr>
+        <w:pStyle w:val="ListBullet"/>
+        <w:spacing w:after="80" w:line="276" w:lineRule="auto"/>
+      </w:pPr>
+      <w:r>
+        <w:rPr>
+          <w:rFonts w:ascii="Arial" w:hAnsi="Arial"/>
+          <w:b/>
+          <w:color w:val="1E293B"/>
+          <w:sz w:val="21"/>
+        </w:rPr>
+        <w:t xml:space="preserve">Language Mirroring Policy: </w:t>
+      </w:r>
+      <w:r>
+        <w:rPr>
+          <w:rFonts w:ascii="Arial" w:hAnsi="Arial"/>
+          <w:color w:val="334155"/>
+          <w:sz w:val="21"/>
+        </w:rPr>
+        <w:t>Juvelle AI dynamically communicates in whatever language, script, or colloquial transliteration the customer prefers, including English, Manglish, Malayalam, Hinglish, Hindi, Tanglish, Tamil, Telugu, and international languages.</w:t>
+      </w:r>
+    </w:p>
+    <w:p>
+      <w:pPr>
+        <w:pStyle w:val="ListBullet"/>
+        <w:spacing w:after="80" w:line="276" w:lineRule="auto"/>
+      </w:pPr>
+      <w:r>
+        <w:rPr>
+          <w:rFonts w:ascii="Arial" w:hAnsi="Arial"/>
+          <w:b/>
+          <w:color w:val="1E293B"/>
+          <w:sz w:val="21"/>
+        </w:rPr>
+        <w:t xml:space="preserve">Hindi &amp; Hinglish Keywords: </w:t>
+      </w:r>
+      <w:r>
+        <w:rPr>
+          <w:rFonts w:ascii="Arial" w:hAnsi="Arial"/>
+          <w:color w:val="334155"/>
+          <w:sz w:val="21"/>
+        </w:rPr>
+        <w:t>Kurti, kurtiyan, daam, rate, kimat, kapda, cotton, delivery charge, size S se XXL, advance online payment UPI, Kerala delivery, Instagram screenshot order.</w:t>
+      </w:r>
+    </w:p>
+    <w:p>
+      <w:pPr>
+        <w:pStyle w:val="ListBullet"/>
+        <w:spacing w:after="80" w:line="276" w:lineRule="auto"/>
+      </w:pPr>
+      <w:r>
+        <w:rPr>
+          <w:rFonts w:ascii="Arial" w:hAnsi="Arial"/>
+          <w:b/>
+          <w:color w:val="1E293B"/>
+          <w:sz w:val="21"/>
+        </w:rPr>
+        <w:t xml:space="preserve">Tamil &amp; Tanglish Keywords: </w:t>
+      </w:r>
+      <w:r>
+        <w:rPr>
+          <w:rFonts w:ascii="Arial" w:hAnsi="Arial"/>
+          <w:color w:val="334155"/>
+          <w:sz w:val="21"/>
+        </w:rPr>
+        <w:t>Churidar top, kurti, evvalavu, vilai, rate, துணி (thuni), cotton, rayon, size S muthal XXL varai, Kerala delivery mattum, Delhivery courier, UPI advance payment.</w:t>
+      </w:r>
+    </w:p>
+    <w:p>
+      <w:pPr>
+        <w:pStyle w:val="ListBullet"/>
+        <w:spacing w:after="80" w:line="276" w:lineRule="auto"/>
+      </w:pPr>
+      <w:r>
+        <w:rPr>
+          <w:rFonts w:ascii="Arial" w:hAnsi="Arial"/>
+          <w:b/>
+          <w:color w:val="1E293B"/>
+          <w:sz w:val="21"/>
+        </w:rPr>
+        <w:t xml:space="preserve">Malayalam &amp; Manglish Keywords: </w:t>
+      </w:r>
+      <w:r>
+        <w:rPr>
+          <w:rFonts w:ascii="Arial" w:hAnsi="Arial"/>
+          <w:color w:val="334155"/>
+          <w:sz w:val="21"/>
+        </w:rPr>
+        <w:t>Churidar tops, kurti, ethraya, vila, rate, cotton, rayon, size S to XXL, Kerala delivery mathram, Delhivery, advance online UPI payment, Instagram screenshot order.</w:t>
       </w:r>
     </w:p>
     <w:sectPr>

</xml_diff>

<commit_message>
fix(agent-kb): strip CRM prompt injection, remove screenshot/booking prompts, and enforce strict AI capability boundaries
</commit_message>
<xml_diff>
--- a/data/Juvelle_Knowledge_Base.docx
+++ b/data/Juvelle_Knowledge_Base.docx
@@ -262,7 +262,76 @@
           <w:color w:val="0F172A"/>
           <w:sz w:val="26"/>
         </w:rPr>
-        <w:t>3. Ordering Process &amp; Payment Methods</w:t>
+        <w:t>3. Ordering Process &amp; AI Capabilities</w:t>
+      </w:r>
+    </w:p>
+    <w:p>
+      <w:pPr>
+        <w:pStyle w:val="ListBullet"/>
+        <w:spacing w:after="80" w:line="276" w:lineRule="auto"/>
+      </w:pPr>
+      <w:r>
+        <w:rPr>
+          <w:rFonts w:ascii="Arial" w:hAnsi="Arial"/>
+          <w:b/>
+          <w:color w:val="1E293B"/>
+          <w:sz w:val="21"/>
+        </w:rPr>
+        <w:t xml:space="preserve">Informational AI Role: </w:t>
+      </w:r>
+      <w:r>
+        <w:rPr>
+          <w:rFonts w:ascii="Arial" w:hAnsi="Arial"/>
+          <w:color w:val="334155"/>
+          <w:sz w:val="21"/>
+        </w:rPr>
+        <w:t>Juvelle AI Assistant provides product catalog information, fabric details, pricing, and sizing guidance only.</w:t>
+      </w:r>
+    </w:p>
+    <w:p>
+      <w:pPr>
+        <w:pStyle w:val="ListBullet"/>
+        <w:spacing w:after="80" w:line="276" w:lineRule="auto"/>
+      </w:pPr>
+      <w:r>
+        <w:rPr>
+          <w:rFonts w:ascii="Arial" w:hAnsi="Arial"/>
+          <w:b/>
+          <w:color w:val="1E293B"/>
+          <w:sz w:val="21"/>
+        </w:rPr>
+        <w:t xml:space="preserve">No Direct Ordering or Booking: </w:t>
+      </w:r>
+      <w:r>
+        <w:rPr>
+          <w:rFonts w:ascii="Arial" w:hAnsi="Arial"/>
+          <w:color w:val="334155"/>
+          <w:sz w:val="21"/>
+        </w:rPr>
+        <w:t>The AI CANNOT directly book orders, reserve stock, process payments, or view screenshots. If asked to place an order or book an item, the AI clearly states that order placement is handled manually by human coordinators on the page.</w:t>
+      </w:r>
+    </w:p>
+    <w:p>
+      <w:pPr>
+        <w:pStyle w:val="ListBullet"/>
+        <w:spacing w:after="80" w:line="276" w:lineRule="auto"/>
+      </w:pPr>
+      <w:r>
+        <w:rPr>
+          <w:rFonts w:ascii="Arial" w:hAnsi="Arial"/>
+          <w:b/>
+          <w:color w:val="1E293B"/>
+          <w:sz w:val="21"/>
+        </w:rPr>
+        <w:t xml:space="preserve">Payment Options: </w:t>
+      </w:r>
+      <w:r>
+        <w:rPr>
+          <w:rFonts w:ascii="Arial" w:hAnsi="Arial"/>
+          <w:color w:val="334155"/>
+          <w:sz w:val="21"/>
+        </w:rPr>
+        <w:t>100% online advance payment via UPI (Google Pay, PhonePe, Paytm, BHIM) or direct Bank Transfer. Cash on Delivery (COD) is NOT available.</w:t>
       </w:r>
     </w:p>
     <w:p>
@@ -285,76 +354,7 @@
           <w:color w:val="334155"/>
           <w:sz w:val="21"/>
         </w:rPr>
-        <w:t>Juvelle operates directly through direct messaging on Instagram and WhatsApp without a separate e-commerce website.</w:t>
-      </w:r>
-    </w:p>
-    <w:p>
-      <w:pPr>
-        <w:pStyle w:val="ListBullet"/>
-        <w:spacing w:after="80" w:line="276" w:lineRule="auto"/>
-      </w:pPr>
-      <w:r>
-        <w:rPr>
-          <w:rFonts w:ascii="Arial" w:hAnsi="Arial"/>
-          <w:b/>
-          <w:color w:val="1E293B"/>
-          <w:sz w:val="21"/>
-        </w:rPr>
-        <w:t xml:space="preserve">How to Order: </w:t>
-      </w:r>
-      <w:r>
-        <w:rPr>
-          <w:rFonts w:ascii="Arial" w:hAnsi="Arial"/>
-          <w:color w:val="334155"/>
-          <w:sz w:val="21"/>
-        </w:rPr>
-        <w:t>Customers simply send a screenshot or photo of the top they like along with their required size (S, M, L, XL, XXL).</w:t>
-      </w:r>
-    </w:p>
-    <w:p>
-      <w:pPr>
-        <w:pStyle w:val="ListBullet"/>
-        <w:spacing w:after="80" w:line="276" w:lineRule="auto"/>
-      </w:pPr>
-      <w:r>
-        <w:rPr>
-          <w:rFonts w:ascii="Arial" w:hAnsi="Arial"/>
-          <w:b/>
-          <w:color w:val="1E293B"/>
-          <w:sz w:val="21"/>
-        </w:rPr>
-        <w:t xml:space="preserve">Payment Options: </w:t>
-      </w:r>
-      <w:r>
-        <w:rPr>
-          <w:rFonts w:ascii="Arial" w:hAnsi="Arial"/>
-          <w:color w:val="334155"/>
-          <w:sz w:val="21"/>
-        </w:rPr>
-        <w:t>100% online advance payment via UPI (Google Pay, PhonePe, Paytm, BHIM) or direct Bank Transfer.</w:t>
-      </w:r>
-    </w:p>
-    <w:p>
-      <w:pPr>
-        <w:pStyle w:val="ListBullet"/>
-        <w:spacing w:after="80" w:line="276" w:lineRule="auto"/>
-      </w:pPr>
-      <w:r>
-        <w:rPr>
-          <w:rFonts w:ascii="Arial" w:hAnsi="Arial"/>
-          <w:b/>
-          <w:color w:val="1E293B"/>
-          <w:sz w:val="21"/>
-        </w:rPr>
-        <w:t xml:space="preserve">No Cash on Delivery: </w:t>
-      </w:r>
-      <w:r>
-        <w:rPr>
-          <w:rFonts w:ascii="Arial" w:hAnsi="Arial"/>
-          <w:color w:val="334155"/>
-          <w:sz w:val="21"/>
-        </w:rPr>
-        <w:t>Cash on Delivery (COD) is NOT available to ensure rapid order processing and next-day dispatch.</w:t>
+        <w:t>Juvelle operations and manual customer support are handled directly on Instagram and WhatsApp.</w:t>
       </w:r>
     </w:p>
     <w:p>
@@ -391,7 +391,7 @@
           <w:color w:val="334155"/>
           <w:sz w:val="21"/>
         </w:rPr>
-        <w:t>Available in sizes S (36), M (38), L (40), XL (42), and XXL (44). Custom size charts can be provided in chat upon request.</w:t>
+        <w:t>Available in sizes S (36), M (38), L (40), XL (42), and XXL (44). Custom size charts can be provided upon request.</w:t>
       </w:r>
     </w:p>
     <w:p>
@@ -460,7 +460,7 @@
           <w:color w:val="334155"/>
           <w:sz w:val="21"/>
         </w:rPr>
-        <w:t>Juvelle's AI assistant has full native voice perception capability to listen to, understand, and process customer voice notes and audio messages directly.</w:t>
+        <w:t>Juvelle's AI assistant has full native voice perception capability to listen to, understand, and process customer voice notes directly.</w:t>
       </w:r>
     </w:p>
     <w:p>
@@ -520,7 +520,7 @@
           <w:color w:val="334155"/>
           <w:sz w:val="21"/>
         </w:rPr>
-        <w:t>Kurti, kurtiyan, daam, rate, kimat, kapda, cotton, delivery charge, size S se XXL, advance online payment UPI, Kerala delivery, Instagram screenshot order.</w:t>
+        <w:t>Kurti, kurtiyan, daam, rate, kimat, kapda, cotton, delivery charge, size S se XXL, advance online payment UPI, Kerala delivery.</w:t>
       </w:r>
     </w:p>
     <w:p>
@@ -566,7 +566,7 @@
           <w:color w:val="334155"/>
           <w:sz w:val="21"/>
         </w:rPr>
-        <w:t>Churidar tops, kurti, ethraya, vila, rate, cotton, rayon, size S to XXL, Kerala delivery mathram, Delhivery, advance online UPI payment, Instagram screenshot order.</w:t>
+        <w:t>Churidar tops, kurti, ethraya, vila, rate, cotton, rayon, size S to XXL, Kerala delivery mathram, Delhivery, advance online UPI payment.</w:t>
       </w:r>
     </w:p>
     <w:sectPr>

</xml_diff>

<commit_message>
fix(agent): restrict strictly to 5 core languages, consolidate RAG, and fix voice transliteration
</commit_message>
<xml_diff>
--- a/data/Juvelle_Knowledge_Base.docx
+++ b/data/Juvelle_Knowledge_Base.docx
@@ -474,7 +474,7 @@
           <w:color w:val="0F172A"/>
           <w:sz w:val="26"/>
         </w:rPr>
-        <w:t>5. Universal Polyglot Support &amp; Multilingual Vocabulary</w:t>
+        <w:t>5. Core Supported Languages &amp; Voice Script Rules</w:t>
       </w:r>
     </w:p>
     <w:p>
@@ -489,7 +489,7 @@
           <w:color w:val="1E293B"/>
           <w:sz w:val="21"/>
         </w:rPr>
-        <w:t xml:space="preserve">Language Mirroring Policy: </w:t>
+        <w:t xml:space="preserve">Strict 5-Language Policy: </w:t>
       </w:r>
       <w:r>
         <w:rPr>
@@ -497,7 +497,7 @@
           <w:color w:val="334155"/>
           <w:sz w:val="21"/>
         </w:rPr>
-        <w:t>Juvelle AI dynamically communicates in whatever language, script, or colloquial transliteration the customer prefers, including English, Manglish, Malayalam, Hinglish, Hindi, Tanglish, Tamil, Telugu, and international languages.</w:t>
+        <w:t>Juvelle AI Assistant communicates exclusively in 5 supported formats: English, Manglish (Malayalam in Latin/English alphabet), Malayalam Script (മലയാളം), Hinglish (Hindi in Latin/English alphabet), and Hindi Script (हिंदी). All other languages default cleanly to English.</w:t>
       </w:r>
     </w:p>
     <w:p>
@@ -512,7 +512,7 @@
           <w:color w:val="1E293B"/>
           <w:sz w:val="21"/>
         </w:rPr>
-        <w:t xml:space="preserve">Hindi &amp; Hinglish Keywords: </w:t>
+        <w:t xml:space="preserve">Voice Note Transliteration Rule: </w:t>
       </w:r>
       <w:r>
         <w:rPr>
@@ -520,7 +520,7 @@
           <w:color w:val="334155"/>
           <w:sz w:val="21"/>
         </w:rPr>
-        <w:t>Kurti, kurtiyan, daam, rate, kimat, kapda, cotton, delivery charge, size S se XXL, advance online payment UPI, Kerala delivery.</w:t>
+        <w:t>For voice notes: Spoken Malayalam defaults to natural Manglish. Spoken Hindi defaults to natural Hinglish. Spoken English defaults to English. Native Unicode scripts are only used if the customer explicitly typed in native script in previous messages.</w:t>
       </w:r>
     </w:p>
     <w:p>
@@ -535,7 +535,7 @@
           <w:color w:val="1E293B"/>
           <w:sz w:val="21"/>
         </w:rPr>
-        <w:t xml:space="preserve">Tamil &amp; Tanglish Keywords: </w:t>
+        <w:t xml:space="preserve">Zero Hallucination Rule: </w:t>
       </w:r>
       <w:r>
         <w:rPr>
@@ -543,30 +543,7 @@
           <w:color w:val="334155"/>
           <w:sz w:val="21"/>
         </w:rPr>
-        <w:t>Churidar top, kurti, evvalavu, vilai, rate, துணி (thuni), cotton, rayon, size S muthal XXL varai, Kerala delivery mattum, Delhivery courier, UPI advance payment.</w:t>
-      </w:r>
-    </w:p>
-    <w:p>
-      <w:pPr>
-        <w:pStyle w:val="ListBullet"/>
-        <w:spacing w:after="80" w:line="276" w:lineRule="auto"/>
-      </w:pPr>
-      <w:r>
-        <w:rPr>
-          <w:rFonts w:ascii="Arial" w:hAnsi="Arial"/>
-          <w:b/>
-          <w:color w:val="1E293B"/>
-          <w:sz w:val="21"/>
-        </w:rPr>
-        <w:t xml:space="preserve">Malayalam &amp; Manglish Keywords: </w:t>
-      </w:r>
-      <w:r>
-        <w:rPr>
-          <w:rFonts w:ascii="Arial" w:hAnsi="Arial"/>
-          <w:color w:val="334155"/>
-          <w:sz w:val="21"/>
-        </w:rPr>
-        <w:t>Churidar tops, kurti, ethraya, vila, rate, cotton, rayon, size S to XXL, Kerala delivery mathram, Delhivery, advance online UPI payment.</w:t>
+        <w:t>The AI never assumes or brings up customer sizes, locations, or orders unprompted. It provides clear, direct catalog facts.</w:t>
       </w:r>
     </w:p>
     <w:sectPr>

</xml_diff>